<commit_message>
docs: expandir guia local com geracao e reset de dados demo
</commit_message>
<xml_diff>
--- a/manuais_and_docs/Growth_Equestre_Guia_Rodar_Local_Time_PT-BR.docx
+++ b/manuais_and_docs/Growth_Equestre_Guia_Rodar_Local_Time_PT-BR.docx
@@ -12,7 +12,7 @@
     </w:p>
     <w:p>
       <w:r>
-        <w:t>Atualizado em: 21/02/2026.</w:t>
+        <w:t>Atualizado em: 22/02/2026.</w:t>
       </w:r>
     </w:p>
     <w:p>
@@ -445,6 +445,104 @@
         <w:t>Pronto. Com estes passos, qualquer pessoa do time consegue reproduzir localmente o mesmo ambiente de demo usado no projeto.</w:t>
       </w:r>
     </w:p>
+    <w:p>
+      <w:pPr>
+        <w:pStyle w:val="Heading1"/>
+      </w:pPr>
+      <w:r>
+        <w:t>11) Como gerar os dados de demo (parceiros e leads)</w:t>
+      </w:r>
+    </w:p>
+    <w:p>
+      <w:r>
+        <w:t>Depois de subir os containers, o time precisa popular dados de demonstracao para ver as telas completas nas duas UIs.</w:t>
+      </w:r>
+    </w:p>
+    <w:p>
+      <w:pPr>
+        <w:pStyle w:val="ListBullet"/>
+      </w:pPr>
+      <w:r>
+        <w:t>1. Gerar parceiros de demo (tabela partners):</w:t>
+      </w:r>
+    </w:p>
+    <w:p>
+      <w:pPr>
+        <w:pStyle w:val="ListBullet"/>
+      </w:pPr>
+      <w:r>
+        <w:t>Invoke-RestMethod -Method Post -Uri http://localhost:3000/demo/seed-partners -ContentType 'application/json' -Body '{"n":1000,"replace":true}'</w:t>
+      </w:r>
+    </w:p>
+    <w:p>
+      <w:pPr>
+        <w:pStyle w:val="ListBullet"/>
+      </w:pPr>
+      <w:r>
+        <w:t>2. Gerar leads de demo (tabela leads):</w:t>
+      </w:r>
+    </w:p>
+    <w:p>
+      <w:pPr>
+        <w:pStyle w:val="ListBullet"/>
+      </w:pPr>
+      <w:r>
+        <w:t>Invoke-RestMethod -Method Post -Uri http://localhost:3000/demo/seed-leads -ContentType 'application/json' -Body '{"n":450,"replace":true}'</w:t>
+      </w:r>
+    </w:p>
+    <w:p>
+      <w:pPr>
+        <w:pStyle w:val="ListBullet"/>
+      </w:pPr>
+      <w:r>
+        <w:t>3. Validar se os dados foram criados:</w:t>
+      </w:r>
+    </w:p>
+    <w:p>
+      <w:pPr>
+        <w:pStyle w:val="ListBullet"/>
+      </w:pPr>
+      <w:r>
+        <w:t>(Invoke-RestMethod http://localhost:3000/partners).Count</w:t>
+      </w:r>
+    </w:p>
+    <w:p>
+      <w:pPr>
+        <w:pStyle w:val="ListBullet"/>
+      </w:pPr>
+      <w:r>
+        <w:t>Invoke-RestMethod http://localhost:3000/partners/summary | Format-Table</w:t>
+      </w:r>
+    </w:p>
+    <w:p>
+      <w:pPr>
+        <w:pStyle w:val="ListBullet"/>
+      </w:pPr>
+      <w:r>
+        <w:t>4. Se precisar reiniciar apenas dados sinteticos:</w:t>
+      </w:r>
+    </w:p>
+    <w:p>
+      <w:pPr>
+        <w:pStyle w:val="ListBullet"/>
+      </w:pPr>
+      <w:r>
+        <w:t>Invoke-RestMethod -Method Post -Uri http://localhost:3000/demo/reset-seeded-leads</w:t>
+      </w:r>
+    </w:p>
+    <w:p>
+      <w:pPr>
+        <w:pStyle w:val="ListBullet"/>
+      </w:pPr>
+      <w:r>
+        <w:t>Invoke-RestMethod -Method Post -Uri http://localhost:3000/demo/reset-partners</w:t>
+      </w:r>
+    </w:p>
+    <w:p>
+      <w:r>
+        <w:t>Observacao importante: apenas montar CSV no volume nao popula a tabela partners automaticamente. O seed acima e o passo oficial para reproduzir o ambiente do projeto.</w:t>
+      </w:r>
+    </w:p>
     <w:sectPr>
       <w:pgSz w:w="12240" w:h="15840"/>
       <w:pgMar w:top="1440" w:right="1800" w:bottom="1440" w:left="1800" w:header="720" w:footer="720" w:gutter="0"/>

</xml_diff>